<commit_message>
feat: Check for Updates button — git pull + uv sync + docker rebuild + auto-restart
</commit_message>
<xml_diff>
--- a/POD_Automator_Proctor_Guide.docx
+++ b/POD_Automator_Proctor_Guide.docx
@@ -1756,6 +1756,60 @@
           <w:tcPr>
             <w:tcW w:type="dxa" w:w="3600"/>
             <w:shd w:val="clear" w:color="auto" w:fill="003865"/>
+            <w:shd w:val="clear" w:color="auto" w:fill="F0FFF4"/>
+          </w:tcPr>
+          <w:p>
+            <w:pPr>
+              <w:jc w:val="center"/>
+            </w:pPr>
+            <w:r>
+              <w:rPr>
+                <w:b/>
+                <w:color w:val="FFFFFF"/>
+                <w:sz w:val="20"/>
+              </w:rPr>
+            </w:r>
+            <w:r>
+              <w:rPr>
+                <w:b/>
+                <w:color w:val="16A34A"/>
+                <w:sz w:val="18"/>
+              </w:rPr>
+              <w:t>⬆ Check for Updates</w:t>
+            </w:r>
+          </w:p>
+        </w:tc>
+        <w:tc>
+          <w:tcPr>
+            <w:tcW w:type="dxa" w:w="5760"/>
+            <w:shd w:val="clear" w:color="auto" w:fill="003865"/>
+            <w:shd w:val="clear" w:color="auto" w:fill="F0FFF4"/>
+          </w:tcPr>
+          <w:p>
+            <w:pPr>
+              <w:jc w:val="center"/>
+            </w:pPr>
+            <w:r>
+              <w:rPr>
+                <w:b/>
+                <w:color w:val="FFFFFF"/>
+                <w:sz w:val="20"/>
+              </w:rPr>
+            </w:r>
+            <w:r>
+              <w:rPr>
+                <w:sz w:val="18"/>
+              </w:rPr>
+              <w:t>Pulls the latest code from GitHub, syncs Python dependencies, and rebuilds the Docker pipeline image if pipeline code changed. Streams live progress in a modal window, then automatically restarts the dashboard and reloads the page. Click this at the start of every prep session before running any PODs.</w:t>
+            </w:r>
+          </w:p>
+        </w:tc>
+      </w:tr>
+      <w:tr>
+        <w:tc>
+          <w:tcPr>
+            <w:tcW w:type="dxa" w:w="3600"/>
+            <w:shd w:val="clear" w:color="auto" w:fill="003865"/>
           </w:tcPr>
           <w:p>
             <w:pPr>
@@ -3663,6 +3717,14 @@
           <w:sz w:val="22"/>
         </w:rPr>
         <w:t>Follow this sequence to prepare all PODs for a lab session:</w:t>
+      </w:r>
+    </w:p>
+    <w:p>
+      <w:r>
+        <w:rPr>
+          <w:b/>
+        </w:rPr>
+        <w:t xml:space="preserve">Before starting: Click "⬆ Check for Updates" in the toolbar to ensure you are running the latest version of POD Automator. The modal will show what changed and restart automatically if an update was applied.</w:t>
       </w:r>
     </w:p>
     <w:p/>

</xml_diff>

<commit_message>
docs: fix jump host IP to 133.36 + add Section 3 Check for Updates guide
</commit_message>
<xml_diff>
--- a/POD_Automator_Proctor_Guide.docx
+++ b/POD_Automator_Proctor_Guide.docx
@@ -99,6 +99,424 @@
       </w:r>
     </w:p>
     <w:p>
+      <w:r>
+        <w:rPr/>
+        <w:br w:type="page"/>
+      </w:r>
+    </w:p>
+    <w:p>
+      <w:pPr/>
+      <w:r>
+        <w:rPr>
+          <w:sz w:val="22"/>
+          <w:szCs w:val="22"/>
+        </w:rPr>
+        <w:t xml:space="preserve"/>
+      </w:r>
+    </w:p>
+    <w:p>
+      <w:pPr/>
+      <w:r>
+        <w:rPr>
+          <w:sz w:val="18"/>
+          <w:szCs w:val="18"/>
+          <w:color w:val="2E7D32"/>
+        </w:rPr>
+        <w:t xml:space="preserve">    pkill -f "python.*dashboard.py" &amp;&amp; uv run python3 dashboard.py</w:t>
+      </w:r>
+    </w:p>
+    <w:p>
+      <w:pPr/>
+      <w:r>
+        <w:rPr>
+          <w:sz w:val="18"/>
+          <w:szCs w:val="18"/>
+          <w:color w:val="2E7D32"/>
+        </w:rPr>
+        <w:t xml:space="preserve">    uv sync</w:t>
+      </w:r>
+    </w:p>
+    <w:p>
+      <w:pPr/>
+      <w:r>
+        <w:rPr>
+          <w:sz w:val="18"/>
+          <w:szCs w:val="18"/>
+          <w:color w:val="2E7D32"/>
+        </w:rPr>
+        <w:t xml:space="preserve">    git pull</w:t>
+      </w:r>
+    </w:p>
+    <w:p>
+      <w:pPr/>
+      <w:r>
+        <w:rPr>
+          <w:sz w:val="18"/>
+          <w:szCs w:val="18"/>
+          <w:color w:val="2E7D32"/>
+        </w:rPr>
+        <w:t xml:space="preserve">    cd ~/POD-Automator</w:t>
+      </w:r>
+    </w:p>
+    <w:p>
+      <w:pPr/>
+      <w:r>
+        <w:rPr>
+          <w:sz w:val="22"/>
+          <w:szCs w:val="22"/>
+        </w:rPr>
+        <w:t xml:space="preserve"/>
+      </w:r>
+    </w:p>
+    <w:p>
+      <w:pPr/>
+      <w:r>
+        <w:rPr>
+          <w:sz w:val="22"/>
+          <w:szCs w:val="22"/>
+        </w:rPr>
+        <w:t xml:space="preserve">If the button shows ERROR: git fetch failed, check that your Mac is connected to the internet and not blocked by a corporate proxy. You can also update manually:</w:t>
+      </w:r>
+    </w:p>
+    <w:p>
+      <w:pPr/>
+      <w:r>
+        <w:rPr>
+          <w:sz w:val="22"/>
+          <w:szCs w:val="22"/>
+        </w:rPr>
+        <w:t xml:space="preserve"/>
+      </w:r>
+    </w:p>
+    <w:p>
+      <w:pPr/>
+      <w:r>
+        <w:rPr>
+          <w:sz w:val="22"/>
+          <w:szCs w:val="22"/>
+        </w:rPr>
+        <w:t xml:space="preserve">The dashboard must have been launched from within the POD-Automator git repository directory, and the Mac must have internet access to reach GitHub (github.com). No GitHub account or token is required — the repository is public.</w:t>
+      </w:r>
+    </w:p>
+    <w:p>
+      <w:pPr/>
+      <w:r>
+        <w:rPr>
+          <w:sz w:val="22"/>
+          <w:szCs w:val="22"/>
+        </w:rPr>
+        <w:t xml:space="preserve"/>
+      </w:r>
+    </w:p>
+    <w:p>
+      <w:pPr/>
+      <w:r>
+        <w:rPr>
+          <w:b/>
+          <w:sz w:val="28"/>
+          <w:szCs w:val="28"/>
+          <w:color w:val="004787"/>
+        </w:rPr>
+        <w:t xml:space="preserve">3.3  Requirements</w:t>
+      </w:r>
+    </w:p>
+    <w:p>
+      <w:pPr/>
+      <w:r>
+        <w:rPr>
+          <w:sz w:val="22"/>
+          <w:szCs w:val="22"/>
+        </w:rPr>
+        <w:t xml:space="preserve"/>
+      </w:r>
+    </w:p>
+    <w:p>
+      <w:pPr/>
+      <w:r>
+        <w:rPr>
+          <w:sz w:val="22"/>
+          <w:szCs w:val="22"/>
+        </w:rPr>
+        <w:t xml:space="preserve">  • ERROR:... — something failed (see Section 15 Troubleshooting)</w:t>
+      </w:r>
+    </w:p>
+    <w:p>
+      <w:pPr/>
+      <w:r>
+        <w:rPr>
+          <w:sz w:val="22"/>
+          <w:szCs w:val="22"/>
+        </w:rPr>
+        <w:t xml:space="preserve">  • DONE:restart — update complete, dashboard restarting in 3 seconds</w:t>
+      </w:r>
+    </w:p>
+    <w:p>
+      <w:pPr/>
+      <w:r>
+        <w:rPr>
+          <w:sz w:val="22"/>
+          <w:szCs w:val="22"/>
+        </w:rPr>
+        <w:t xml:space="preserve">  • [update] Rebuilding Docker image... — wait 2–4 minutes, do not close browser</w:t>
+      </w:r>
+    </w:p>
+    <w:p>
+      <w:pPr/>
+      <w:r>
+        <w:rPr>
+          <w:sz w:val="22"/>
+          <w:szCs w:val="22"/>
+        </w:rPr>
+        <w:t xml:space="preserve">  • [update] Docker rebuild not needed — pipeline code unchanged</w:t>
+      </w:r>
+    </w:p>
+    <w:p>
+      <w:pPr/>
+      <w:r>
+        <w:rPr>
+          <w:sz w:val="22"/>
+          <w:szCs w:val="22"/>
+        </w:rPr>
+        <w:t xml:space="preserve">  • [update] Dependencies unchanged — skipping uv sync — fast path, no pip install needed</w:t>
+      </w:r>
+    </w:p>
+    <w:p>
+      <w:pPr/>
+      <w:r>
+        <w:rPr>
+          <w:sz w:val="22"/>
+          <w:szCs w:val="22"/>
+        </w:rPr>
+        <w:t xml:space="preserve">  • [update] Update available: abc1234 → def5678 — update in progress</w:t>
+      </w:r>
+    </w:p>
+    <w:p>
+      <w:pPr/>
+      <w:r>
+        <w:rPr>
+          <w:sz w:val="22"/>
+          <w:szCs w:val="22"/>
+        </w:rPr>
+        <w:t xml:space="preserve">  • [update] Already up to date (abc1234) — no action needed, modal shows Close button</w:t>
+      </w:r>
+    </w:p>
+    <w:p>
+      <w:pPr/>
+      <w:r>
+        <w:rPr>
+          <w:sz w:val="22"/>
+          <w:szCs w:val="22"/>
+        </w:rPr>
+        <w:t xml:space="preserve"/>
+      </w:r>
+    </w:p>
+    <w:p>
+      <w:pPr/>
+      <w:r>
+        <w:rPr>
+          <w:sz w:val="22"/>
+          <w:szCs w:val="22"/>
+        </w:rPr>
+        <w:t xml:space="preserve">The log modal streams output line by line so you can see exactly what changed. Look for these key messages:</w:t>
+      </w:r>
+    </w:p>
+    <w:p>
+      <w:pPr/>
+      <w:r>
+        <w:rPr>
+          <w:sz w:val="22"/>
+          <w:szCs w:val="22"/>
+        </w:rPr>
+        <w:t xml:space="preserve"/>
+      </w:r>
+    </w:p>
+    <w:p>
+      <w:pPr/>
+      <w:r>
+        <w:rPr>
+          <w:b/>
+          <w:sz w:val="28"/>
+          <w:szCs w:val="28"/>
+          <w:color w:val="004787"/>
+        </w:rPr>
+        <w:t xml:space="preserve">3.2  What the Modal Shows</w:t>
+      </w:r>
+    </w:p>
+    <w:p>
+      <w:pPr/>
+      <w:r>
+        <w:rPr>
+          <w:sz w:val="22"/>
+          <w:szCs w:val="22"/>
+        </w:rPr>
+        <w:t xml:space="preserve"/>
+      </w:r>
+    </w:p>
+    <w:p>
+      <w:pPr/>
+      <w:r>
+        <w:rPr>
+          <w:sz w:val="22"/>
+          <w:szCs w:val="22"/>
+        </w:rPr>
+        <w:t xml:space="preserve">  6.  Restarts the dashboard automatically — page reloads after 6 seconds</w:t>
+      </w:r>
+    </w:p>
+    <w:p>
+      <w:pPr/>
+      <w:r>
+        <w:rPr>
+          <w:sz w:val="22"/>
+          <w:szCs w:val="22"/>
+        </w:rPr>
+        <w:t xml:space="preserve">  5.  Rebuilds the Docker pipeline image only if pipeline code changed (rare — takes 2–4 min)</w:t>
+      </w:r>
+    </w:p>
+    <w:p>
+      <w:pPr/>
+      <w:r>
+        <w:rPr>
+          <w:sz w:val="22"/>
+          <w:szCs w:val="22"/>
+        </w:rPr>
+        <w:t xml:space="preserve">  4.  Runs uv sync if Python dependencies changed (pyproject.toml updated)</w:t>
+      </w:r>
+    </w:p>
+    <w:p>
+      <w:pPr/>
+      <w:r>
+        <w:rPr>
+          <w:sz w:val="22"/>
+          <w:szCs w:val="22"/>
+        </w:rPr>
+        <w:t xml:space="preserve">  3.  If an update is available — pulls the new code (git pull)</w:t>
+      </w:r>
+    </w:p>
+    <w:p>
+      <w:pPr/>
+      <w:r>
+        <w:rPr>
+          <w:sz w:val="22"/>
+          <w:szCs w:val="22"/>
+        </w:rPr>
+        <w:t xml:space="preserve">  2.  If already up to date — shows "Already up to date" and closes. No restart.</w:t>
+      </w:r>
+    </w:p>
+    <w:p>
+      <w:pPr/>
+      <w:r>
+        <w:rPr>
+          <w:sz w:val="22"/>
+          <w:szCs w:val="22"/>
+        </w:rPr>
+        <w:t xml:space="preserve">  1.  Fetches the latest code from GitHub (git fetch)</w:t>
+      </w:r>
+    </w:p>
+    <w:p>
+      <w:pPr/>
+      <w:r>
+        <w:rPr>
+          <w:sz w:val="22"/>
+          <w:szCs w:val="22"/>
+        </w:rPr>
+        <w:t xml:space="preserve"/>
+      </w:r>
+    </w:p>
+    <w:p>
+      <w:pPr/>
+      <w:r>
+        <w:rPr>
+          <w:sz w:val="22"/>
+          <w:szCs w:val="22"/>
+        </w:rPr>
+        <w:t xml:space="preserve">The button opens a live log modal and performs the following steps automatically:</w:t>
+      </w:r>
+    </w:p>
+    <w:p>
+      <w:pPr/>
+      <w:r>
+        <w:rPr>
+          <w:sz w:val="22"/>
+          <w:szCs w:val="22"/>
+        </w:rPr>
+        <w:t xml:space="preserve"/>
+      </w:r>
+    </w:p>
+    <w:p>
+      <w:pPr/>
+      <w:r>
+        <w:rPr>
+          <w:sz w:val="22"/>
+          <w:szCs w:val="22"/>
+        </w:rPr>
+        <w:t xml:space="preserve">At the start of every prep session, before uploading the CSV or connecting VPN, click the ⬆ Check for Updates button in the top toolbar.</w:t>
+      </w:r>
+    </w:p>
+    <w:p>
+      <w:pPr/>
+      <w:r>
+        <w:rPr>
+          <w:sz w:val="22"/>
+          <w:szCs w:val="22"/>
+        </w:rPr>
+        <w:t xml:space="preserve"/>
+      </w:r>
+    </w:p>
+    <w:p>
+      <w:pPr/>
+      <w:r>
+        <w:rPr>
+          <w:b/>
+          <w:sz w:val="28"/>
+          <w:szCs w:val="28"/>
+          <w:color w:val="004787"/>
+        </w:rPr>
+        <w:t xml:space="preserve">3.1  How to Update</w:t>
+      </w:r>
+    </w:p>
+    <w:p>
+      <w:pPr/>
+      <w:r>
+        <w:rPr>
+          <w:sz w:val="22"/>
+          <w:szCs w:val="22"/>
+        </w:rPr>
+        <w:t xml:space="preserve"/>
+      </w:r>
+    </w:p>
+    <w:p>
+      <w:pPr/>
+      <w:r>
+        <w:rPr>
+          <w:sz w:val="22"/>
+          <w:szCs w:val="22"/>
+        </w:rPr>
+        <w:t xml:space="preserve">POD Automator updates are published to GitHub regularly — bug fixes, pipeline improvements, and new features. The ⬆ Check for Updates button in the dashboard toolbar ensures every proctor is always running the latest version without any manual git commands.</w:t>
+      </w:r>
+    </w:p>
+    <w:p>
+      <w:pPr/>
+      <w:r>
+        <w:rPr>
+          <w:sz w:val="22"/>
+          <w:szCs w:val="22"/>
+        </w:rPr>
+        <w:t xml:space="preserve"/>
+      </w:r>
+    </w:p>
+    <w:p>
+      <w:pPr/>
+      <w:r>
+        <w:rPr>
+          <w:b/>
+          <w:sz w:val="36"/>
+          <w:szCs w:val="36"/>
+          <w:color w:val="00BCEB"/>
+        </w:rPr>
+        <w:t xml:space="preserve">3  Keeping POD Automator Up to Date</w:t>
+      </w:r>
+    </w:p>
+    <w:p>
       <w:pPr>
         <w:spacing w:before="40" w:after="40"/>
       </w:pPr>
@@ -107,7 +525,7 @@
           <w:b/>
           <w:sz w:val="22"/>
         </w:rPr>
-        <w:t xml:space="preserve">  3  Starting the Dashboard</w:t>
+        <w:t xml:space="preserve">  4  Starting the Dashboard</w:t>
       </w:r>
     </w:p>
     <w:p>
@@ -119,7 +537,7 @@
           <w:b/>
           <w:sz w:val="22"/>
         </w:rPr>
-        <w:t xml:space="preserve">  4  Uploading POD Session CSV</w:t>
+        <w:t xml:space="preserve">  5  Uploading POD Session CSV</w:t>
       </w:r>
     </w:p>
     <w:p>
@@ -131,7 +549,7 @@
           <w:b/>
           <w:sz w:val="22"/>
         </w:rPr>
-        <w:t xml:space="preserve">  5  Dashboard Layout &amp; Controls</w:t>
+        <w:t xml:space="preserve">  6  Dashboard Layout &amp; Controls</w:t>
       </w:r>
     </w:p>
     <w:p>
@@ -176,7 +594,7 @@
           <w:b/>
           <w:sz w:val="22"/>
         </w:rPr>
-        <w:t xml:space="preserve">  6  Running the Pipeline (Step-by-Step)</w:t>
+        <w:t xml:space="preserve">  7  Running the Pipeline (Step-by-Step)</w:t>
       </w:r>
     </w:p>
     <w:p>
@@ -188,7 +606,7 @@
           <w:b/>
           <w:sz w:val="22"/>
         </w:rPr>
-        <w:t xml:space="preserve">  7  Pipeline Steps Reference</w:t>
+        <w:t xml:space="preserve">  8  Pipeline Steps Reference</w:t>
       </w:r>
     </w:p>
     <w:p>
@@ -200,7 +618,7 @@
           <w:b/>
           <w:sz w:val="22"/>
         </w:rPr>
-        <w:t xml:space="preserve">  8  Switch &amp; Router Verification</w:t>
+        <w:t xml:space="preserve">  9  Switch &amp; Router Verification</w:t>
       </w:r>
     </w:p>
     <w:p>
@@ -212,7 +630,7 @@
           <w:b/>
           <w:sz w:val="22"/>
         </w:rPr>
-        <w:t xml:space="preserve">  9  SCC Org Reset</w:t>
+        <w:t xml:space="preserve">  10  SCC Org Reset</w:t>
       </w:r>
     </w:p>
     <w:p>
@@ -224,7 +642,7 @@
           <w:b/>
           <w:sz w:val="22"/>
         </w:rPr>
-        <w:t xml:space="preserve">  10  Duo Integration</w:t>
+        <w:t xml:space="preserve">  11  Duo Integration</w:t>
       </w:r>
     </w:p>
     <w:p>
@@ -236,7 +654,7 @@
           <w:b/>
           <w:sz w:val="22"/>
         </w:rPr>
-        <w:t xml:space="preserve">  11  ISE Integration</w:t>
+        <w:t xml:space="preserve">  12  ISE Integration</w:t>
       </w:r>
     </w:p>
     <w:p>
@@ -248,7 +666,7 @@
           <w:b/>
           <w:sz w:val="22"/>
         </w:rPr>
-        <w:t xml:space="preserve">  12  Software Upgrades</w:t>
+        <w:t xml:space="preserve">  13  Software Upgrades</w:t>
       </w:r>
     </w:p>
     <w:p>
@@ -260,7 +678,7 @@
           <w:b/>
           <w:sz w:val="22"/>
         </w:rPr>
-        <w:t xml:space="preserve">  13  Generating Lab Detail Cards (PDF)</w:t>
+        <w:t xml:space="preserve">  14  Generating Lab Detail Cards (PDF)</w:t>
       </w:r>
     </w:p>
     <w:p>
@@ -272,7 +690,7 @@
           <w:b/>
           <w:sz w:val="22"/>
         </w:rPr>
-        <w:t xml:space="preserve">  14  Cleanup Before Next Session</w:t>
+        <w:t xml:space="preserve">  15  Cleanup Before Next Session</w:t>
       </w:r>
     </w:p>
     <w:p>
@@ -284,7 +702,7 @@
           <w:b/>
           <w:sz w:val="22"/>
         </w:rPr>
-        <w:t xml:space="preserve">  15  Troubleshooting Quick Reference</w:t>
+        <w:t xml:space="preserve">  16  Troubleshooting Quick Reference</w:t>
       </w:r>
     </w:p>
     <w:p>
@@ -296,7 +714,7 @@
           <w:b/>
           <w:sz w:val="22"/>
         </w:rPr>
-        <w:t xml:space="preserve">  16  Infrastructure Reference</w:t>
+        <w:t xml:space="preserve">  17  Infrastructure Reference</w:t>
       </w:r>
     </w:p>
     <w:p>
@@ -1192,7 +1610,7 @@
           <w:color w:val="00BCEB"/>
           <w:sz w:val="36"/>
         </w:rPr>
-        <w:t>3  Starting the Dashboard</w:t>
+        <w:t>4  Starting the Dashboard</w:t>
       </w:r>
     </w:p>
     <w:p>
@@ -1422,7 +1840,7 @@
           <w:color w:val="00BCEB"/>
           <w:sz w:val="36"/>
         </w:rPr>
-        <w:t>4  Uploading POD Session CSV</w:t>
+        <w:t>5  Uploading POD Session CSV</w:t>
       </w:r>
     </w:p>
     <w:p>
@@ -1714,7 +2132,7 @@
           <w:color w:val="00BCEB"/>
           <w:sz w:val="36"/>
         </w:rPr>
-        <w:t>5  Dashboard Layout &amp; Controls</w:t>
+        <w:t>6  Dashboard Layout &amp; Controls</w:t>
       </w:r>
     </w:p>
     <w:p>
@@ -1800,7 +2218,15 @@
               <w:rPr>
                 <w:sz w:val="18"/>
               </w:rPr>
-              <w:t>Pulls the latest code from GitHub, syncs Python dependencies, and rebuilds the Docker pipeline image if pipeline code changed. Streams live progress in a modal window, then automatically restarts the dashboard and reloads the page. Click this at the start of every prep session before running any PODs.</w:t>
+            </w:r>
+            <w:r>
+              <w:rPr>
+                <w:sz w:val="18"/>
+              </w:rPr>
+              <w:t>Pulls the latest code from GitHub, syncs Python dependencies, and automatically rebuilds the Docker pipeline image if pipeline code (onboard_router.py) changed. A live log modal streams progress in real time. When complete, the dashboard restarts automatically and the page reloads.</w:t>
+              <w:br/>
+              <w:br/>
+              <w:t>Click this at the start of every prep session before uploading the CSV or running any PODs. If already up to date the modal closes with "Already up to date" — no restart occurs. If a Docker rebuild is needed (rare — only when pipeline logic changes) allow 2–4 minutes for it to complete.</w:t>
             </w:r>
           </w:p>
         </w:tc>
@@ -3706,7 +4132,7 @@
           <w:color w:val="00BCEB"/>
           <w:sz w:val="36"/>
         </w:rPr>
-        <w:t>6  Running the Pipeline — Step by Step</w:t>
+        <w:t>7  Running the Pipeline — Step by Step</w:t>
       </w:r>
     </w:p>
     <w:p>
@@ -3967,7 +4393,7 @@
           <w:color w:val="00BCEB"/>
           <w:sz w:val="36"/>
         </w:rPr>
-        <w:t>7  Pipeline Steps Reference</w:t>
+        <w:t>8  Pipeline Steps Reference</w:t>
       </w:r>
     </w:p>
     <w:p>
@@ -5342,7 +5768,7 @@
           <w:color w:val="00BCEB"/>
           <w:sz w:val="36"/>
         </w:rPr>
-        <w:t>8  Switch &amp; Router Verification</w:t>
+        <w:t>9  Switch &amp; Router Verification</w:t>
       </w:r>
     </w:p>
     <w:p>
@@ -5802,7 +6228,7 @@
           <w:color w:val="00BCEB"/>
           <w:sz w:val="36"/>
         </w:rPr>
-        <w:t>9  SCC Org Reset</w:t>
+        <w:t>10  SCC Org Reset</w:t>
       </w:r>
     </w:p>
     <w:p>
@@ -6382,7 +6808,7 @@
           <w:color w:val="00BCEB"/>
           <w:sz w:val="36"/>
         </w:rPr>
-        <w:t>10  Duo Integration</w:t>
+        <w:t>11  Duo Integration</w:t>
       </w:r>
     </w:p>
     <w:p>
@@ -6998,7 +7424,7 @@
           <w:color w:val="00BCEB"/>
           <w:sz w:val="36"/>
         </w:rPr>
-        <w:t>11  ISE Integration</w:t>
+        <w:t>12  ISE Integration</w:t>
       </w:r>
     </w:p>
     <w:p>
@@ -7207,7 +7633,7 @@
           <w:color w:val="00BCEB"/>
           <w:sz w:val="36"/>
         </w:rPr>
-        <w:t>12  Software Upgrades</w:t>
+        <w:t>13  Software Upgrades</w:t>
       </w:r>
     </w:p>
     <w:p>
@@ -7420,7 +7846,7 @@
           <w:color w:val="00BCEB"/>
           <w:sz w:val="36"/>
         </w:rPr>
-        <w:t>13  Generating Lab Detail Cards (PDF)</w:t>
+        <w:t>14  Generating Lab Detail Cards (PDF)</w:t>
       </w:r>
     </w:p>
     <w:p>
@@ -7800,7 +8226,7 @@
               <w:rPr>
                 <w:sz w:val="18"/>
               </w:rPr>
-              <w:t>198.18.133.35</w:t>
+              <w:t>198.18.133.36</w:t>
             </w:r>
           </w:p>
         </w:tc>
@@ -7922,7 +8348,7 @@
           <w:color w:val="00BCEB"/>
           <w:sz w:val="36"/>
         </w:rPr>
-        <w:t>14  Cleanup Before the Next Session</w:t>
+        <w:t>15  Cleanup Before the Next Session</w:t>
       </w:r>
     </w:p>
     <w:p>
@@ -8214,7 +8640,7 @@
           <w:color w:val="00BCEB"/>
           <w:sz w:val="36"/>
         </w:rPr>
-        <w:t>15  Troubleshooting Quick Reference</w:t>
+        <w:t>16  Troubleshooting Quick Reference</w:t>
       </w:r>
     </w:p>
     <w:tbl>
@@ -8789,7 +9215,7 @@
           <w:color w:val="00BCEB"/>
           <w:sz w:val="36"/>
         </w:rPr>
-        <w:t>16  Infrastructure Reference</w:t>
+        <w:t>17  Infrastructure Reference</w:t>
       </w:r>
     </w:p>
     <w:p>
@@ -9516,7 +9942,7 @@
               <w:rPr>
                 <w:sz w:val="18"/>
               </w:rPr>
-              <w:t>198.18.133.35</w:t>
+              <w:t>198.18.133.36</w:t>
             </w:r>
           </w:p>
         </w:tc>

</xml_diff>

<commit_message>
docs: add KB sharing docs — README, Proctor Guide Section 4, KB_QUICK_START.md
</commit_message>
<xml_diff>
--- a/POD_Automator_Proctor_Guide.docx
+++ b/POD_Automator_Proctor_Guide.docx
@@ -530,6 +530,14 @@
     </w:p>
     <w:p>
       <w:pPr>
+        <w:pStyle w:val="Normal"/>
+      </w:pPr>
+      <w:r>
+        <w:t xml:space="preserve">  4  Knowledge Base</w:t>
+      </w:r>
+    </w:p>
+    <w:p>
+      <w:pPr>
         <w:spacing w:before="40" w:after="40"/>
       </w:pPr>
       <w:r>
@@ -583,6 +591,232 @@
           <w:sz w:val="22"/>
         </w:rPr>
         <w:t xml:space="preserve">    5.3  POD Detail Panel — Tabs</w:t>
+      </w:r>
+    </w:p>
+    <w:p>
+      <w:pPr>
+        <w:pStyle w:val="Normal"/>
+      </w:pPr>
+    </w:p>
+    <w:p>
+      <w:pPr>
+        <w:pStyle w:val="Normal"/>
+      </w:pPr>
+      <w:r>
+        <w:t xml:space="preserve">Use the Check for Updates button at the start of every session — it pulls any new shared articles automatically.</w:t>
+      </w:r>
+    </w:p>
+    <w:p>
+      <w:pPr>
+        <w:pStyle w:val="Normal"/>
+      </w:pPr>
+    </w:p>
+    <w:p>
+      <w:pPr>
+        <w:pStyle w:val="Heading2"/>
+      </w:pPr>
+      <w:r>
+        <w:t xml:space="preserve">4.4  Pulling Updates from the Shared KB</w:t>
+      </w:r>
+    </w:p>
+    <w:p>
+      <w:pPr>
+        <w:pStyle w:val="Normal"/>
+      </w:pPr>
+    </w:p>
+    <w:p>
+      <w:pPr>
+        <w:pStyle w:val="ListBullet"/>
+      </w:pPr>
+      <w:r>
+        <w:t xml:space="preserve">Status badge at the top of the tab shows: 🌐 Connected to Shared KB — mokuma56/POD-Automator-KB</w:t>
+      </w:r>
+    </w:p>
+    <w:p>
+      <w:pPr>
+        <w:pStyle w:val="ListBullet"/>
+      </w:pPr>
+      <w:r>
+        <w:t xml:space="preserve">No GitHub account or token setup required — a shared write token is pre-configured in the tool.</w:t>
+      </w:r>
+    </w:p>
+    <w:p>
+      <w:pPr>
+        <w:pStyle w:val="ListBullet"/>
+      </w:pPr>
+      <w:r>
+        <w:t xml:space="preserve">Once submitted, your article appears in every other proctor's dashboard on their next Check for Updates.</w:t>
+      </w:r>
+    </w:p>
+    <w:p>
+      <w:pPr>
+        <w:pStyle w:val="ListBullet"/>
+      </w:pPr>
+      <w:r>
+        <w:t xml:space="preserve">Click 🌐 Contribute on any article row — it is pushed to the shared KB in seconds.</w:t>
+      </w:r>
+    </w:p>
+    <w:p>
+      <w:pPr>
+        <w:pStyle w:val="ListBullet"/>
+      </w:pPr>
+      <w:r>
+        <w:t xml:space="preserve">Write the article in the New Article form. Fill in Title, Body, Tags, and Category, then click Save.</w:t>
+      </w:r>
+    </w:p>
+    <w:p>
+      <w:pPr>
+        <w:pStyle w:val="ListBullet"/>
+      </w:pPr>
+      <w:r>
+        <w:t xml:space="preserve">Open the dashboard → Knowledge Base tab → click + New Article.</w:t>
+      </w:r>
+    </w:p>
+    <w:p>
+      <w:pPr>
+        <w:pStyle w:val="Normal"/>
+      </w:pPr>
+      <w:r>
+        <w:t xml:space="preserve">To contribute an article to the shared team KB:</w:t>
+      </w:r>
+    </w:p>
+    <w:p>
+      <w:pPr>
+        <w:pStyle w:val="Normal"/>
+      </w:pPr>
+    </w:p>
+    <w:p>
+      <w:pPr>
+        <w:pStyle w:val="Heading2"/>
+      </w:pPr>
+      <w:r>
+        <w:t xml:space="preserve">4.3  Contributing an Article to the Shared KB</w:t>
+      </w:r>
+    </w:p>
+    <w:p>
+      <w:pPr>
+        <w:pStyle w:val="Normal"/>
+      </w:pPr>
+    </w:p>
+    <w:p>
+      <w:pPr>
+        <w:pStyle w:val="ListBullet"/>
+      </w:pPr>
+      <w:r>
+        <w:t xml:space="preserve">Category — choose the best fit: general, sdwan, switches, infrastructure, troubleshooting, procedure</w:t>
+      </w:r>
+    </w:p>
+    <w:p>
+      <w:pPr>
+        <w:pStyle w:val="ListBullet"/>
+      </w:pPr>
+      <w:r>
+        <w:t xml:space="preserve">Tags — comma-separated keywords (e.g. bootstrap, config-register, sdwan)</w:t>
+      </w:r>
+    </w:p>
+    <w:p>
+      <w:pPr>
+        <w:pStyle w:val="ListBullet"/>
+      </w:pPr>
+      <w:r>
+        <w:t xml:space="preserve">Body — your notes in plain text or Markdown. Be specific: include error messages, exact CLI commands, and the fix.</w:t>
+      </w:r>
+    </w:p>
+    <w:p>
+      <w:pPr>
+        <w:pStyle w:val="ListBullet"/>
+      </w:pPr>
+      <w:r>
+        <w:t xml:space="preserve">Title — short, descriptive. Use the error or symptom as the title (e.g. Router boots with no config — 0x2142).</w:t>
+      </w:r>
+    </w:p>
+    <w:p>
+      <w:pPr>
+        <w:pStyle w:val="Normal"/>
+      </w:pPr>
+      <w:r>
+        <w:t xml:space="preserve">Every article has four fields:</w:t>
+      </w:r>
+    </w:p>
+    <w:p>
+      <w:pPr>
+        <w:pStyle w:val="Normal"/>
+      </w:pPr>
+    </w:p>
+    <w:p>
+      <w:pPr>
+        <w:pStyle w:val="Heading2"/>
+      </w:pPr>
+      <w:r>
+        <w:t xml:space="preserve">4.2  Writing a Good Article</w:t>
+      </w:r>
+    </w:p>
+    <w:p>
+      <w:pPr>
+        <w:pStyle w:val="Normal"/>
+      </w:pPr>
+    </w:p>
+    <w:p>
+      <w:pPr>
+        <w:pStyle w:val="ListBullet"/>
+      </w:pPr>
+      <w:r>
+        <w:t xml:space="preserve">Ask bar — type a natural language question; the system finds the most relevant articles and drafts an answer. Requires Ollama running locally (see Section 2.5).</w:t>
+      </w:r>
+    </w:p>
+    <w:p>
+      <w:pPr>
+        <w:pStyle w:val="ListBullet"/>
+      </w:pPr>
+      <w:r>
+        <w:t xml:space="preserve">Search bar — type keywords or a full question. Results are ranked by semantic similarity, not just keyword match.</w:t>
+      </w:r>
+    </w:p>
+    <w:p>
+      <w:pPr>
+        <w:pStyle w:val="Normal"/>
+      </w:pPr>
+      <w:r>
+        <w:t xml:space="preserve">The Knowledge Base tab has two ways to find information:</w:t>
+      </w:r>
+    </w:p>
+    <w:p>
+      <w:pPr>
+        <w:pStyle w:val="Normal"/>
+      </w:pPr>
+    </w:p>
+    <w:p>
+      <w:pPr>
+        <w:pStyle w:val="Heading2"/>
+      </w:pPr>
+      <w:r>
+        <w:t xml:space="preserve">4.1  Searching the Knowledge Base</w:t>
+      </w:r>
+    </w:p>
+    <w:p>
+      <w:pPr>
+        <w:pStyle w:val="Normal"/>
+      </w:pPr>
+    </w:p>
+    <w:p>
+      <w:pPr>
+        <w:pStyle w:val="Normal"/>
+      </w:pPr>
+      <w:r>
+        <w:t xml:space="preserve">The Proctor Knowledge Base is a shared, searchable library of troubleshooting notes, pipeline fixes, and infrastructure tips. Articles are written by proctors and automatically shared across all installations via the shared GitHub repository (mokuma56/POD-Automator-KB). New articles are pulled on every Check for Updates. Any proctor can contribute an article back to the shared library in one click — no GitHub account required.</w:t>
+      </w:r>
+    </w:p>
+    <w:p>
+      <w:pPr>
+        <w:pStyle w:val="Normal"/>
+      </w:pPr>
+    </w:p>
+    <w:p>
+      <w:pPr>
+        <w:pStyle w:val="Heading1"/>
+      </w:pPr>
+      <w:r>
+        <w:t xml:space="preserve">4  Knowledge Base</w:t>
       </w:r>
     </w:p>
     <w:p>
@@ -4061,12 +4295,7 @@
     </w:p>
     <w:p>
       <w:r>
-        <w:rPr>
-          <w:b w:val="0"/>
-          <w:i w:val="0"/>
-          <w:sz w:val="22"/>
-        </w:rPr>
-        <w:t>Searchable knowledge base with AI-assisted answers:</w:t>
+        <w:t>The shared proctor Knowledge Base — pull the latest articles, write your own, and contribute them to the team:</w:t>
       </w:r>
     </w:p>
     <w:p>
@@ -4075,9 +4304,6 @@
         <w:ind w:left="432"/>
       </w:pPr>
       <w:r>
-        <w:rPr>
-          <w:sz w:val="22"/>
-        </w:rPr>
         <w:t>Search bar — semantic search across all published articles</w:t>
       </w:r>
     </w:p>
@@ -4087,10 +4313,7 @@
         <w:ind w:left="432"/>
       </w:pPr>
       <w:r>
-        <w:rPr>
-          <w:sz w:val="22"/>
-        </w:rPr>
-        <w:t>Ask bar — natural language question answered by local Ollama AI using KB content</w:t>
+        <w:t>🌐 Contribute button — share any published article to the shared KB (mokuma56/POD-Automator-KB) in one click. No GitHub account needed — built-in shared token handles it automatically.</w:t>
       </w:r>
     </w:p>
     <w:p>
@@ -4099,10 +4322,7 @@
         <w:ind w:left="432"/>
       </w:pPr>
       <w:r>
-        <w:rPr>
-          <w:sz w:val="22"/>
-        </w:rPr>
-        <w:t>Paste Doc — paste any text (Cisco docs, release notes) to add it to the KB</w:t>
+        <w:t>New articles are pulled automatically on every Check for Updates and at dashboard startup</w:t>
       </w:r>
     </w:p>
     <w:p>
@@ -4111,10 +4331,7 @@
         <w:ind w:left="432"/>
       </w:pPr>
       <w:r>
-        <w:rPr>
-          <w:sz w:val="22"/>
-        </w:rPr>
-        <w:t>Seed from AGENTS.md — imports all known issues and infrastructure notes</w:t>
+        <w:t>Ask bar — natural language question answered by local Ollama AI (optional — search works without it)</w:t>
       </w:r>
     </w:p>
     <w:p>

</xml_diff>

<commit_message>
docs: update README and Proctor Guide for standalone KB modal — Section 5.1 card row, KB modal description
</commit_message>
<xml_diff>
--- a/POD_Automator_Proctor_Guide.docx
+++ b/POD_Automator_Proctor_Guide.docx
@@ -572,6 +572,18 @@
       </w:r>
     </w:p>
     <w:p>
+      <w:r>
+        <w:t xml:space="preserve"/>
+      </w:r>
+    </w:p>
+    <w:p>
+      <w:r>
+        <w:t xml:space="preserve"/>
+      </w:r>
+    </w:p>
+    <w:p/>
+    <w:p/>
+    <w:p>
       <w:pPr>
         <w:spacing w:before="40" w:after="40"/>
       </w:pPr>
@@ -697,13 +709,16 @@
       <w:pPr>
         <w:pStyle w:val="Normal"/>
       </w:pPr>
+      <w:r>
+        <w:t>To contribute an article to the shared team KB:</w:t>
+      </w:r>
     </w:p>
     <w:p>
       <w:pPr>
         <w:pStyle w:val="ListBullet"/>
       </w:pPr>
       <w:r>
-        <w:t xml:space="preserve">Category — choose the best fit: general, sdwan, switches, infrastructure, troubleshooting, procedure</w:t>
+        <w:t>Open the KB modal — click the 📚 Knowledge Base card at the top of the dashboard.</w:t>
       </w:r>
     </w:p>
     <w:p>
@@ -711,7 +726,7 @@
         <w:pStyle w:val="ListBullet"/>
       </w:pPr>
       <w:r>
-        <w:t xml:space="preserve">Tags — comma-separated keywords (e.g. bootstrap, config-register, sdwan)</w:t>
+        <w:t>Write the article: click + New Article, fill in Title, Body, Tags, and Category, then Save.</w:t>
       </w:r>
     </w:p>
     <w:p>
@@ -719,7 +734,7 @@
         <w:pStyle w:val="ListBullet"/>
       </w:pPr>
       <w:r>
-        <w:t xml:space="preserve">Body — your notes in plain text or Markdown. Be specific: include error messages, exact CLI commands, and the fix.</w:t>
+        <w:t>Find your article in the list.</w:t>
       </w:r>
     </w:p>
     <w:p>
@@ -727,76 +742,82 @@
         <w:pStyle w:val="ListBullet"/>
       </w:pPr>
       <w:r>
-        <w:t xml:space="preserve">Title — short, descriptive. Use the error or symptom as the title (e.g. Router boots with no config — 0x2142).</w:t>
+        <w:t>Click 🌐 Contribute on the right side of the article row.</w:t>
+      </w:r>
+    </w:p>
+    <w:p>
+      <w:pPr>
+        <w:pStyle w:val="ListBullet"/>
+      </w:pPr>
+      <w:r>
+        <w:t>Wait 2–3 seconds — the button turns green: ✓ Contributed!</w:t>
+      </w:r>
+    </w:p>
+    <w:p>
+      <w:pPr>
+        <w:pStyle w:val="ListBullet"/>
+      </w:pPr>
+      <w:r>
+        <w:t>All other proctors receive the article on their next ⬆ Check for Updates.</w:t>
+      </w:r>
+    </w:p>
+    <w:p>
+      <w:pPr>
+        <w:pStyle w:val="Heading2"/>
+      </w:pPr>
+      <w:r>
+        <w:t xml:space="preserve">4.2  Writing a Good Article</w:t>
       </w:r>
     </w:p>
     <w:p>
       <w:pPr>
         <w:pStyle w:val="Normal"/>
       </w:pPr>
-      <w:r>
-        <w:t xml:space="preserve">Every article has four fields:</w:t>
+    </w:p>
+    <w:p>
+      <w:pPr>
+        <w:pStyle w:val="ListBullet"/>
+      </w:pPr>
+      <w:r>
+        <w:t xml:space="preserve">Ask bar — type a natural language question; the system finds the most relevant articles and drafts an answer. Requires Ollama running locally (see Section 2.5).</w:t>
+      </w:r>
+    </w:p>
+    <w:p>
+      <w:pPr>
+        <w:pStyle w:val="ListBullet"/>
+      </w:pPr>
+      <w:r>
+        <w:t xml:space="preserve">Search bar — type keywords or a full question. Results are ranked by semantic similarity, not just keyword match.</w:t>
       </w:r>
     </w:p>
     <w:p>
       <w:pPr>
         <w:pStyle w:val="Normal"/>
       </w:pPr>
+      <w:r>
+        <w:t xml:space="preserve">The Knowledge Base tab has two ways to find information:</w:t>
+      </w:r>
+    </w:p>
+    <w:p>
+      <w:pPr>
+        <w:pStyle w:val="Normal"/>
+      </w:pPr>
     </w:p>
     <w:p>
       <w:pPr>
         <w:pStyle w:val="Heading2"/>
       </w:pPr>
       <w:r>
-        <w:t xml:space="preserve">4.2  Writing a Good Article</w:t>
+        <w:t xml:space="preserve">4.1  Searching the Knowledge Base</w:t>
       </w:r>
     </w:p>
     <w:p>
       <w:pPr>
         <w:pStyle w:val="Normal"/>
       </w:pPr>
-    </w:p>
-    <w:p>
-      <w:pPr>
-        <w:pStyle w:val="ListBullet"/>
-      </w:pPr>
-      <w:r>
-        <w:t xml:space="preserve">Ask bar — type a natural language question; the system finds the most relevant articles and drafts an answer. Requires Ollama running locally (see Section 2.5).</w:t>
-      </w:r>
-    </w:p>
-    <w:p>
-      <w:pPr>
-        <w:pStyle w:val="ListBullet"/>
-      </w:pPr>
-      <w:r>
-        <w:t xml:space="preserve">Search bar — type keywords or a full question. Results are ranked by semantic similarity, not just keyword match.</w:t>
-      </w:r>
-    </w:p>
-    <w:p>
-      <w:pPr>
-        <w:pStyle w:val="Normal"/>
-      </w:pPr>
-      <w:r>
-        <w:t xml:space="preserve">The Knowledge Base tab has two ways to find information:</w:t>
-      </w:r>
-    </w:p>
-    <w:p>
-      <w:pPr>
-        <w:pStyle w:val="Normal"/>
-      </w:pPr>
-    </w:p>
-    <w:p>
-      <w:pPr>
-        <w:pStyle w:val="Heading2"/>
-      </w:pPr>
-      <w:r>
-        <w:t xml:space="preserve">4.1  Searching the Knowledge Base</w:t>
-      </w:r>
-    </w:p>
-    <w:p>
-      <w:pPr>
-        <w:pStyle w:val="Normal"/>
-      </w:pPr>
+      <w:r>
+        <w:t>Open the KB modal by clicking the 📚 Knowledge Base card at the top of the dashboard (or the Knowledge Base tab inside any POD detail panel). The modal has two ways to find information:</w:t>
+      </w:r>
     </w:p>
     <w:p>
       <w:pPr>
@@ -2384,12 +2405,7 @@
     </w:p>
     <w:p>
       <w:r>
-        <w:rPr>
-          <w:b w:val="0"/>
-          <w:i w:val="0"/>
-          <w:sz w:val="22"/>
-        </w:rPr>
-        <w:t>The top section of the dashboard contains the following global controls:</w:t>
+        <w:t>The top section of the dashboard contains four cards arranged in a row, followed by global action controls:</w:t>
       </w:r>
     </w:p>
     <w:tbl>
@@ -2806,7 +2822,76 @@
         </w:tc>
       </w:tr>
     </w:tbl>
-    <w:p/>
+    <w:p>
+      <w:r>
+        <w:t xml:space="preserve"/>
+      </w:r>
+    </w:p>
+    <w:p>
+      <w:r>
+        <w:t xml:space="preserve">Top card row (left to right):</w:t>
+      </w:r>
+    </w:p>
+    <w:p>
+      <w:pPr>
+        <w:pStyle w:val="ListBullet"/>
+        <w:ind w:left="432"/>
+      </w:pPr>
+      <w:r>
+        <w:rPr>
+          <w:b/>
+        </w:rPr>
+        <w:t xml:space="preserve">Upload Event CSV — </w:t>
+      </w:r>
+      <w:r>
+        <w:t xml:space="preserve">drag-and-drop or click to upload EventsDetails.csv from your dCloud booking. Populates the POD table.</w:t>
+      </w:r>
+    </w:p>
+    <w:p>
+      <w:pPr>
+        <w:pStyle w:val="ListBullet"/>
+        <w:ind w:left="432"/>
+      </w:pPr>
+      <w:r>
+        <w:rPr>
+          <w:b/>
+        </w:rPr>
+        <w:t xml:space="preserve">📚 Knowledge Base — </w:t>
+      </w:r>
+      <w:r>
+        <w:t xml:space="preserve">shows the live article count and three most recent articles. Click the card, + New Article, or Search to open the standalone KB modal — no POD row required.</w:t>
+      </w:r>
+    </w:p>
+    <w:p>
+      <w:pPr>
+        <w:pStyle w:val="ListBullet"/>
+        <w:ind w:left="432"/>
+      </w:pPr>
+      <w:r>
+        <w:rPr>
+          <w:b/>
+        </w:rPr>
+        <w:t xml:space="preserve">Switch Image (C9300) — </w:t>
+      </w:r>
+      <w:r>
+        <w:t xml:space="preserve">set the golden firmware version and upload the switch .bin image for upgrades.</w:t>
+      </w:r>
+    </w:p>
+    <w:p>
+      <w:pPr>
+        <w:pStyle w:val="ListBullet"/>
+        <w:ind w:left="432"/>
+      </w:pPr>
+      <w:r>
+        <w:rPr>
+          <w:b/>
+        </w:rPr>
+        <w:t xml:space="preserve">Router Image (C8231-G2) — </w:t>
+      </w:r>
+      <w:r>
+        <w:t xml:space="preserve">set the golden firmware version and upload the router .bin image for upgrades.</w:t>
+      </w:r>
+    </w:p>
     <w:p>
       <w:pPr>
         <w:pStyle w:val="Heading2"/>
@@ -4295,7 +4380,7 @@
     </w:p>
     <w:p>
       <w:r>
-        <w:t>The shared proctor Knowledge Base — pull the latest articles, write your own, and contribute them to the team:</w:t>
+        <w:t>The Knowledge Base is also accessible as a tab inside the POD detail panel. For standalone access (no POD row required), use the 📚 Knowledge Base card at the top of the dashboard — it opens a full-screen modal with the same full functionality:</w:t>
       </w:r>
     </w:p>
     <w:p>

</xml_diff>

<commit_message>
docs: update KB quick start and proctor guide for new features
- KB_QUICK_START.md / .docx:
  - Access via top-card 📚 KB button (not POD detail tab)
  - Screenshots: 📷 Add Screenshot button, auto-inserts markdown
  - 16 lab-section categories with full list
  - Token setup: first-time prompt, where token is stored, 401 recovery
  - Contribute pushes images to shared repo automatically
  - Removed 'no token needed' claim (was relying on revoked baked-in token)

- POD_Automator_Proctor_Guide.docx Section 4:
  - 4.1 Accessing the KB (top card)
  - 4.2 Searching
  - 4.3 Writing a Good Article (updated categories)
  - 4.4 Adding Screenshots (new)
  - 4.5 Contributing + 4.5.1 Shared KB Token (new - token flow documented)
  - 4.6 Pulling Updates
</commit_message>
<xml_diff>
--- a/POD_Automator_Proctor_Guide.docx
+++ b/POD_Automator_Proctor_Guide.docx
@@ -625,23 +625,102 @@
     </w:p>
     <w:p>
       <w:pPr>
+        <w:pStyle w:val="Heading1"/>
+      </w:pPr>
+      <w:r>
+        <w:rPr>
+          <w:b w:val="0"/>
+        </w:rPr>
+        <w:t>4  Knowledge Base</w:t>
+      </w:r>
+    </w:p>
+    <w:p>
+      <w:pPr/>
+      <w:r>
+        <w:rPr>
+          <w:b w:val="0"/>
+        </w:rPr>
+        <w:t>The Proctor Knowledge Base is a shared, searchable library of troubleshooting notes, pipeline fixes, and infrastructure tips contributed by the proctor team. Articles and screenshots are automatically synced across every proctor's installation.</w:t>
+      </w:r>
+    </w:p>
+    <w:p>
+      <w:pPr/>
+    </w:p>
+    <w:p>
+      <w:pPr>
         <w:pStyle w:val="Heading2"/>
       </w:pPr>
       <w:r>
-        <w:t xml:space="preserve">4.4  Pulling Updates from the Shared KB</w:t>
-      </w:r>
-    </w:p>
-    <w:p>
-      <w:pPr>
-        <w:pStyle w:val="Normal"/>
-      </w:pPr>
+        <w:rPr>
+          <w:b w:val="0"/>
+        </w:rPr>
+        <w:t>4.1  Accessing the KB</w:t>
+      </w:r>
+    </w:p>
+    <w:p>
+      <w:pPr/>
+      <w:r>
+        <w:rPr>
+          <w:b w:val="0"/>
+        </w:rPr>
+        <w:t>Click the 📚 KB card in the top row of the dashboard. The KB opens as a full-screen panel accessible from anywhere — no POD row needs to be open.</w:t>
+      </w:r>
+    </w:p>
+    <w:p>
+      <w:pPr/>
+    </w:p>
+    <w:p>
+      <w:pPr>
+        <w:pStyle w:val="Heading2"/>
+      </w:pPr>
+      <w:r>
+        <w:rPr>
+          <w:b w:val="0"/>
+        </w:rPr>
+        <w:t>4.2  Searching the Knowledge Base</w:t>
+      </w:r>
+    </w:p>
+    <w:p>
+      <w:pPr/>
+      <w:r>
+        <w:rPr>
+          <w:b w:val="0"/>
+        </w:rPr>
+        <w:t>Type any keyword or full question into the Search bar and press Enter or click Search. Results are ranked by semantic similarity — try symptom phrases like router no config, switch vlan leftover, ISE pxgrid, or bootstrap 0x2142.</w:t>
+      </w:r>
+    </w:p>
+    <w:p>
+      <w:pPr/>
+    </w:p>
+    <w:p>
+      <w:pPr>
+        <w:pStyle w:val="Heading2"/>
+      </w:pPr>
+      <w:r>
+        <w:rPr>
+          <w:b w:val="0"/>
+        </w:rPr>
+        <w:t>4.3  Writing a Good Article</w:t>
+      </w:r>
+    </w:p>
+    <w:p>
+      <w:pPr/>
+      <w:r>
+        <w:rPr>
+          <w:b w:val="0"/>
+        </w:rPr>
+        <w:t>Captured a fix during the session? Write it down before you forget.</w:t>
+      </w:r>
     </w:p>
     <w:p>
       <w:pPr>
         <w:pStyle w:val="ListBullet"/>
       </w:pPr>
       <w:r>
-        <w:t xml:space="preserve">Status badge at the top of the tab shows: 🌐 Connected to Shared KB — mokuma56/POD-Automator-KB</w:t>
+        <w:rPr>
+          <w:b w:val="0"/>
+        </w:rPr>
+        <w:t>Click + New Article in the KB panel.</w:t>
       </w:r>
     </w:p>
     <w:p>
@@ -649,7 +728,10 @@
         <w:pStyle w:val="ListBullet"/>
       </w:pPr>
       <w:r>
-        <w:t xml:space="preserve">No GitHub account or token setup required — a shared write token is pre-configured in the tool.</w:t>
+        <w:rPr>
+          <w:b w:val="0"/>
+        </w:rPr>
+        <w:t>Fill in Title (use the symptom), Body (what happened, what fixed it, exact CLI), Tags (comma-separated), and Category (pick the matching lab section).</w:t>
       </w:r>
     </w:p>
     <w:p>
@@ -657,7 +739,36 @@
         <w:pStyle w:val="ListBullet"/>
       </w:pPr>
       <w:r>
-        <w:t xml:space="preserve">Once submitted, your article appears in every other proctor's dashboard on their next Check for Updates.</w:t>
+        <w:rPr>
+          <w:b w:val="0"/>
+        </w:rPr>
+        <w:t>Click Save — the article is published immediately and searchable.</w:t>
+      </w:r>
+    </w:p>
+    <w:p>
+      <w:pPr/>
+    </w:p>
+    <w:p>
+      <w:pPr/>
+      <w:r>
+        <w:rPr>
+          <w:b w:val="0"/>
+        </w:rPr>
+        <w:t>Categories match the 16 lab sections: SDA Fabric Provisioning, EVPN Fabric Provisioning, EVPN Catalyst Center Discovery, Configure &amp; Test WLC, Macro / Micro Segmentation, Enable SGTs, Connect Infrastructure, Connect DUO IDP, Secure Private Access Configuration, Secure Internet Access Configure, Secure SD-WAN Local Enforcement, Secure Firewall - SGT Enforcement, Experience Insights Integration, NDFC - DC Fabric Deployment, Install Thousandeyes Agents on Leaf Switches, and General.</w:t>
+      </w:r>
+    </w:p>
+    <w:p>
+      <w:pPr/>
+    </w:p>
+    <w:p>
+      <w:pPr>
+        <w:pStyle w:val="Heading2"/>
+      </w:pPr>
+      <w:r>
+        <w:rPr>
+          <w:b w:val="0"/>
+        </w:rPr>
+        <w:t>4.4  Adding Screenshots to an Article</w:t>
       </w:r>
     </w:p>
     <w:p>
@@ -665,7 +776,10 @@
         <w:pStyle w:val="ListBullet"/>
       </w:pPr>
       <w:r>
-        <w:t xml:space="preserve">Click 🌐 Contribute on any article row — it is pushed to the shared KB in seconds.</w:t>
+        <w:rPr>
+          <w:b w:val="0"/>
+        </w:rPr>
+        <w:t>Click 📷 Add Screenshot below the body text area while editing an article.</w:t>
       </w:r>
     </w:p>
     <w:p>
@@ -673,7 +787,10 @@
         <w:pStyle w:val="ListBullet"/>
       </w:pPr>
       <w:r>
-        <w:t xml:space="preserve">Write the article in the New Article form. Fill in Title, Body, Tags, and Category, then click Save.</w:t>
+        <w:rPr>
+          <w:b w:val="0"/>
+        </w:rPr>
+        <w:t>Select a PNG, JPG, GIF, or WebP file — it uploads instantly and a markdown reference is inserted into the body.</w:t>
       </w:r>
     </w:p>
     <w:p>
@@ -681,36 +798,44 @@
         <w:pStyle w:val="ListBullet"/>
       </w:pPr>
       <w:r>
-        <w:t xml:space="preserve">Open the dashboard → Knowledge Base tab → click + New Article.</w:t>
-      </w:r>
-    </w:p>
-    <w:p>
-      <w:pPr>
-        <w:pStyle w:val="Normal"/>
-      </w:pPr>
-      <w:r>
-        <w:t xml:space="preserve">To contribute an article to the shared team KB:</w:t>
-      </w:r>
-    </w:p>
-    <w:p>
-      <w:pPr>
-        <w:pStyle w:val="Normal"/>
-      </w:pPr>
+        <w:rPr>
+          <w:b w:val="0"/>
+        </w:rPr>
+        <w:t>Save the article. The image is stored locally and displayed inline.</w:t>
+      </w:r>
+    </w:p>
+    <w:p>
+      <w:pPr>
+        <w:pStyle w:val="ListBullet"/>
+      </w:pPr>
+      <w:r>
+        <w:rPr>
+          <w:b w:val="0"/>
+        </w:rPr>
+        <w:t>When you Contribute the article, all screenshots are automatically pushed to the shared KB repo so every other proctor sees them.</w:t>
+      </w:r>
+    </w:p>
+    <w:p>
+      <w:pPr/>
     </w:p>
     <w:p>
       <w:pPr>
         <w:pStyle w:val="Heading2"/>
       </w:pPr>
       <w:r>
-        <w:t xml:space="preserve">4.3  Contributing an Article to the Shared KB</w:t>
-      </w:r>
-    </w:p>
-    <w:p>
-      <w:pPr>
-        <w:pStyle w:val="Normal"/>
-      </w:pPr>
-      <w:r>
-        <w:t>To contribute an article to the shared team KB:</w:t>
+        <w:rPr>
+          <w:b w:val="0"/>
+        </w:rPr>
+        <w:t>4.5  Contributing an Article to the Shared KB</w:t>
+      </w:r>
+    </w:p>
+    <w:p>
+      <w:pPr/>
+      <w:r>
+        <w:rPr>
+          <w:b w:val="0"/>
+        </w:rPr>
+        <w:t>Once saved, an article lives only on your machine. To share it with the team:</w:t>
       </w:r>
     </w:p>
     <w:p>
@@ -718,7 +843,10 @@
         <w:pStyle w:val="ListBullet"/>
       </w:pPr>
       <w:r>
-        <w:t>Open the KB modal — click the 📚 Knowledge Base card at the top of the dashboard.</w:t>
+        <w:rPr>
+          <w:b w:val="0"/>
+        </w:rPr>
+        <w:t>Find your article in the list.</w:t>
       </w:r>
     </w:p>
     <w:p>
@@ -726,7 +854,10 @@
         <w:pStyle w:val="ListBullet"/>
       </w:pPr>
       <w:r>
-        <w:t>Write the article: click + New Article, fill in Title, Body, Tags, and Category, then Save.</w:t>
+        <w:rPr>
+          <w:b w:val="0"/>
+        </w:rPr>
+        <w:t>Click 🌐 Contribute on the right side of the article row.</w:t>
       </w:r>
     </w:p>
     <w:p>
@@ -734,7 +865,10 @@
         <w:pStyle w:val="ListBullet"/>
       </w:pPr>
       <w:r>
-        <w:t>Find your article in the list.</w:t>
+        <w:rPr>
+          <w:b w:val="0"/>
+        </w:rPr>
+        <w:t>First time only: a token prompt appears — paste the Shared KB Token your proctor lead gave you and click Save &amp; Contribute. The token is saved locally and you will never be asked again on this machine.</w:t>
       </w:r>
     </w:p>
     <w:p>
@@ -742,7 +876,10 @@
         <w:pStyle w:val="ListBullet"/>
       </w:pPr>
       <w:r>
-        <w:t>Click 🌐 Contribute on the right side of the article row.</w:t>
+        <w:rPr>
+          <w:b w:val="0"/>
+        </w:rPr>
+        <w:t>Wait 2–3 seconds — the button turns green: ✓ Contributed!</w:t>
       </w:r>
     </w:p>
     <w:p>
@@ -750,7 +887,83 @@
         <w:pStyle w:val="ListBullet"/>
       </w:pPr>
       <w:r>
-        <w:t>Wait 2–3 seconds — the button turns green: ✓ Contributed!</w:t>
+        <w:rPr>
+          <w:b w:val="0"/>
+        </w:rPr>
+        <w:t>All other proctors receive the article and its screenshots on their next ⬆ Check for Updates.</w:t>
+      </w:r>
+    </w:p>
+    <w:p>
+      <w:pPr/>
+    </w:p>
+    <w:p>
+      <w:pPr>
+        <w:pStyle w:val="Heading3"/>
+      </w:pPr>
+      <w:r>
+        <w:rPr>
+          <w:b w:val="0"/>
+        </w:rPr>
+        <w:t>4.5.1  Shared KB Token</w:t>
+      </w:r>
+    </w:p>
+    <w:p>
+      <w:pPr/>
+      <w:r>
+        <w:rPr>
+          <w:b w:val="0"/>
+        </w:rPr>
+        <w:t>The Shared KB Token is a GitHub Personal Access Token (classic) with public_repo scope only, issued from the mokuma56 GitHub account. It allows proctors to push articles and images to the shared KB repo.</w:t>
+      </w:r>
+    </w:p>
+    <w:p>
+      <w:pPr/>
+      <w:r>
+        <w:rPr>
+          <w:b w:val="0"/>
+        </w:rPr>
+        <w:t>Your proctor lead will provide this token. Enter it once in the token prompt when you first click Contribute.</w:t>
+      </w:r>
+    </w:p>
+    <w:p>
+      <w:pPr/>
+      <w:r>
+        <w:rPr>
+          <w:b w:val="0"/>
+        </w:rPr>
+        <w:t>The token is stored in data/kb_token.txt on your local machine. It is never committed to git or shared with anyone.</w:t>
+      </w:r>
+    </w:p>
+    <w:p>
+      <w:pPr/>
+      <w:r>
+        <w:rPr>
+          <w:b w:val="0"/>
+        </w:rPr>
+        <w:t>If the token is revoked or expires, the Contribute button will show a 401 error and the token prompt will reappear automatically — just enter the new token.</w:t>
+      </w:r>
+    </w:p>
+    <w:p>
+      <w:pPr/>
+    </w:p>
+    <w:p>
+      <w:pPr>
+        <w:pStyle w:val="Heading2"/>
+      </w:pPr>
+      <w:r>
+        <w:rPr>
+          <w:b w:val="0"/>
+        </w:rPr>
+        <w:t>4.6  Pulling Updates from the Shared KB</w:t>
+      </w:r>
+    </w:p>
+    <w:p>
+      <w:pPr/>
+      <w:r>
+        <w:rPr>
+          <w:b w:val="0"/>
+        </w:rPr>
+        <w:t>Articles and images are pulled automatically on dashboard startup and on every ⬆ Check for Updates run. To pull manually:</w:t>
       </w:r>
     </w:p>
     <w:p>
@@ -758,237 +971,25 @@
         <w:pStyle w:val="ListBullet"/>
       </w:pPr>
       <w:r>
-        <w:t>All other proctors receive the article on their next ⬆ Check for Updates.</w:t>
-      </w:r>
-    </w:p>
-    <w:p>
-      <w:pPr>
-        <w:pStyle w:val="Heading2"/>
-      </w:pPr>
-      <w:r>
-        <w:t xml:space="preserve">4.2  Writing a Good Article</w:t>
-      </w:r>
-    </w:p>
-    <w:p>
-      <w:pPr>
-        <w:pStyle w:val="Normal"/>
-      </w:pPr>
+        <w:rPr>
+          <w:b w:val="0"/>
+        </w:rPr>
+        <w:t>cd ~/POD-Automator &amp;&amp; uv run python3 kb_sync.py pull</w:t>
+      </w:r>
     </w:p>
     <w:p>
       <w:pPr>
         <w:pStyle w:val="ListBullet"/>
       </w:pPr>
       <w:r>
-        <w:t xml:space="preserve">Ask bar — type a natural language question; the system finds the most relevant articles and drafts an answer. Requires Ollama running locally (see Section 2.5).</w:t>
-      </w:r>
-    </w:p>
-    <w:p>
-      <w:pPr>
-        <w:pStyle w:val="ListBullet"/>
-      </w:pPr>
-      <w:r>
-        <w:t xml:space="preserve">Search bar — type keywords or a full question. Results are ranked by semantic similarity, not just keyword match.</w:t>
-      </w:r>
-    </w:p>
-    <w:p>
-      <w:pPr>
-        <w:pStyle w:val="Normal"/>
-      </w:pPr>
-      <w:r>
-        <w:t xml:space="preserve">The Knowledge Base tab has two ways to find information:</w:t>
-      </w:r>
-    </w:p>
-    <w:p>
-      <w:pPr>
-        <w:pStyle w:val="Normal"/>
-      </w:pPr>
-    </w:p>
-    <w:p>
-      <w:pPr>
-        <w:pStyle w:val="Heading2"/>
-      </w:pPr>
-      <w:r>
-        <w:t xml:space="preserve">4.1  Searching the Knowledge Base</w:t>
-      </w:r>
-    </w:p>
-    <w:p>
-      <w:pPr>
-        <w:pStyle w:val="Normal"/>
-      </w:pPr>
-      <w:r>
-        <w:t>Open the KB modal by clicking the 📚 Knowledge Base card at the top of the dashboard (or the Knowledge Base tab inside any POD detail panel). The modal has two ways to find information:</w:t>
-      </w:r>
-    </w:p>
-    <w:p>
-      <w:pPr>
-        <w:pStyle w:val="Normal"/>
-      </w:pPr>
-      <w:r>
-        <w:t xml:space="preserve">The Proctor Knowledge Base is a shared, searchable library of troubleshooting notes, pipeline fixes, and infrastructure tips. Articles are written by proctors and automatically shared across all installations via the shared GitHub repository (mokuma56/POD-Automator-KB). New articles are pulled on every Check for Updates. Any proctor can contribute an article back to the shared library in one click — no GitHub account required.</w:t>
-      </w:r>
-    </w:p>
-    <w:p>
-      <w:pPr>
-        <w:pStyle w:val="Normal"/>
-      </w:pPr>
-    </w:p>
-    <w:p>
-      <w:pPr>
-        <w:pStyle w:val="Heading1"/>
-      </w:pPr>
-      <w:r>
-        <w:t xml:space="preserve">4  Knowledge Base</w:t>
-      </w:r>
-    </w:p>
-    <w:p>
-      <w:pPr>
-        <w:spacing w:before="40" w:after="40"/>
-      </w:pPr>
-      <w:r>
         <w:rPr>
-          <w:b/>
-          <w:sz w:val="22"/>
+          <w:b w:val="0"/>
         </w:rPr>
-        <w:t xml:space="preserve">  7  Running the Pipeline (Step-by-Step)</w:t>
-      </w:r>
-    </w:p>
-    <w:p>
-      <w:pPr>
-        <w:spacing w:before="40" w:after="40"/>
-      </w:pPr>
-      <w:r>
-        <w:rPr>
-          <w:b/>
-          <w:sz w:val="22"/>
-        </w:rPr>
-        <w:t xml:space="preserve">  8  Pipeline Steps Reference</w:t>
-      </w:r>
-    </w:p>
-    <w:p>
-      <w:pPr>
-        <w:spacing w:before="40" w:after="40"/>
-      </w:pPr>
-      <w:r>
-        <w:rPr>
-          <w:b/>
-          <w:sz w:val="22"/>
-        </w:rPr>
-        <w:t xml:space="preserve">  9  Switch &amp; Router Verification</w:t>
-      </w:r>
-    </w:p>
-    <w:p>
-      <w:pPr>
-        <w:spacing w:before="40" w:after="40"/>
-      </w:pPr>
-      <w:r>
-        <w:rPr>
-          <w:b/>
-          <w:sz w:val="22"/>
-        </w:rPr>
-        <w:t xml:space="preserve">  10  SCC Org Reset</w:t>
-      </w:r>
-    </w:p>
-    <w:p>
-      <w:pPr>
-        <w:spacing w:before="40" w:after="40"/>
-      </w:pPr>
-      <w:r>
-        <w:rPr>
-          <w:b/>
-          <w:sz w:val="22"/>
-        </w:rPr>
-        <w:t xml:space="preserve">  11  Duo Integration</w:t>
-      </w:r>
-    </w:p>
-    <w:p>
-      <w:pPr>
-        <w:spacing w:before="40" w:after="40"/>
-      </w:pPr>
-      <w:r>
-        <w:rPr>
-          <w:b/>
-          <w:sz w:val="22"/>
-        </w:rPr>
-        <w:t xml:space="preserve">  12  ISE Integration</w:t>
-      </w:r>
-    </w:p>
-    <w:p>
-      <w:pPr>
-        <w:spacing w:before="40" w:after="40"/>
-      </w:pPr>
-      <w:r>
-        <w:rPr>
-          <w:b/>
-          <w:sz w:val="22"/>
-        </w:rPr>
-        <w:t xml:space="preserve">  13  Software Upgrades</w:t>
-      </w:r>
-    </w:p>
-    <w:p>
-      <w:pPr>
-        <w:spacing w:before="40" w:after="40"/>
-      </w:pPr>
-      <w:r>
-        <w:rPr>
-          <w:b/>
-          <w:sz w:val="22"/>
-        </w:rPr>
-        <w:t xml:space="preserve">  14  Generating Lab Detail Cards (PDF)</w:t>
-      </w:r>
-    </w:p>
-    <w:p>
-      <w:pPr>
-        <w:spacing w:before="40" w:after="40"/>
-      </w:pPr>
-      <w:r>
-        <w:rPr>
-          <w:b/>
-          <w:sz w:val="22"/>
-        </w:rPr>
-        <w:t xml:space="preserve">  15  Cleanup Before Next Session</w:t>
-      </w:r>
-    </w:p>
-    <w:p>
-      <w:pPr>
-        <w:spacing w:before="40" w:after="40"/>
-      </w:pPr>
-      <w:r>
-        <w:rPr>
-          <w:b/>
-          <w:sz w:val="22"/>
-        </w:rPr>
-        <w:t xml:space="preserve">  16  Troubleshooting Quick Reference</w:t>
-      </w:r>
-    </w:p>
-    <w:p>
-      <w:pPr>
-        <w:spacing w:before="40" w:after="40"/>
-      </w:pPr>
-      <w:r>
-        <w:rPr>
-          <w:b/>
-          <w:sz w:val="22"/>
-        </w:rPr>
-        <w:t xml:space="preserve">  17  Infrastructure Reference</w:t>
-      </w:r>
-    </w:p>
-    <w:p>
-      <w:r>
-        <w:br w:type="page"/>
-      </w:r>
-    </w:p>
-    <w:p>
-      <w:pPr>
-        <w:pStyle w:val="Heading1"/>
-      </w:pPr>
-      <w:r>
-        <w:rPr>
-          <w:b/>
-          <w:color w:val="00BCEB"/>
-          <w:sz w:val="36"/>
-        </w:rPr>
-        <w:t>1  Overview</w:t>
-      </w:r>
+        <w:t>To check how many new articles are available: uv run python3 kb_sync.py status</w:t>
+      </w:r>
+    </w:p>
+    <w:p>
+      <w:pPr/>
     </w:p>
     <w:p>
       <w:r>

</xml_diff>

<commit_message>
feat(ise): click pxGrid Cloud checkbox via physical mouse event
Dijit CheckBox in newer ISE ignores JS set()/node.click() the same way
SCC's React pages do. Locate the widget coordinates in JS, then drive
page.mouse.click() so Dijit's onChange handler sees a trusted event.
Adds debug screenshots at the catalog-nav, form-loaded, and deploy-fail
points (they land in data/, which is gitignored).

Also: refresh_scc_sessions.run() reworked, python-docx dependency added,
and project CLAUDE.md / .mcp.json checked in.

Co-Authored-By: Claude Opus 5 <noreply@anthropic.com>
</commit_message>
<xml_diff>
--- a/POD_Automator_Proctor_Guide.docx
+++ b/POD_Automator_Proctor_Guide.docx
@@ -53,7 +53,7 @@
           <w:color w:val="777777"/>
           <w:sz w:val="22"/>
         </w:rPr>
-        <w:t>Version 1.0  ·  July 2026</w:t>
+        <w:t>Version 1.1  ·  July 2026</w:t>
       </w:r>
     </w:p>
     <w:p>
@@ -155,7 +155,7 @@
           <w:szCs w:val="18"/>
           <w:color w:val="2E7D32"/>
         </w:rPr>
-        <w:t xml:space="preserve">    cd ~/POD-Automator</w:t>
+        <w:t xml:space="preserve">    cd ~/sw_projects/pod_automator</w:t>
       </w:r>
     </w:p>
     <w:p>
@@ -974,7 +974,7 @@
         <w:rPr>
           <w:b w:val="0"/>
         </w:rPr>
-        <w:t>cd ~/POD-Automator &amp;&amp; uv run python3 kb_sync.py pull</w:t>
+        <w:t>cd ~/sw_projects/pod_automator &amp;&amp; uv run python3 kb_sync.py pull</w:t>
       </w:r>
     </w:p>
     <w:p>
@@ -1562,7 +1562,7 @@
           <w:color w:val="2E7D32"/>
           <w:sz w:val="18"/>
         </w:rPr>
-        <w:t>git clone https://github.com/mokuma56/POD-Automator.git</w:t>
+        <w:t>git clone https://github.com/mokuma56/pod_automator.git</w:t>
       </w:r>
     </w:p>
     <w:p>
@@ -1903,7 +1903,7 @@
           <w:color w:val="2E7D32"/>
           <w:sz w:val="18"/>
         </w:rPr>
-        <w:t>cd ~/POD-Automator</w:t>
+        <w:t>cd ~/sw_projects/pod_automator</w:t>
       </w:r>
     </w:p>
     <w:p>
@@ -8529,7 +8529,7 @@
               <w:rPr>
                 <w:sz w:val="18"/>
               </w:rPr>
-              <w:t>198.18.133.36</w:t>
+              <w:t>198.18.133.35</w:t>
             </w:r>
           </w:p>
         </w:tc>
@@ -8925,7 +8925,7 @@
           <w:color w:val="2E7D32"/>
           <w:sz w:val="18"/>
         </w:rPr>
-        <w:t>cd ~/POD-Automator &amp;&amp; bash docker/stop.sh</w:t>
+        <w:t>cd ~/sw_projects/pod_automator &amp;&amp; bash docker/stop.sh</w:t>
       </w:r>
     </w:p>
     <w:p>
@@ -10934,7 +10934,7 @@
           <w:color w:val="2E7D32"/>
           <w:sz w:val="18"/>
         </w:rPr>
-        <w:t>cd ~/POD-Automator &amp;&amp; nohup uv run python3 dashboard.py &gt; /tmp/dashboard.log 2&gt;&amp;1 &amp;</w:t>
+        <w:t>cd ~/sw_projects/pod_automator &amp;&amp; nohup uv run python3 dashboard.py &gt; /tmp/dashboard.log 2&gt;&amp;1 &amp;</w:t>
       </w:r>
     </w:p>
     <w:p>

</xml_diff>